<commit_message>
Word Estimatif : totaux dans le tableau des lots, sections facultatives
- TOTAL GÉNÉRAL TRAVAUX HT, TVA et TOTAL GÉNÉRAL TRAVAUX TTC : trois
  lignes du tableau des lots (plus de petit tableau séparé).
- Sections Présentation générale du projet, Objet de la mission et Points
  de vigilance, dans l'ordre demandé, masquées (titre compris) si vides ;
  phrase « Proposition d'honoraires » seulement si le dossier a un contrat.
- Champs dans la fenêtre Estimatif et dans l'assistant : listes à puces
  modifiables (ajouter, supprimer, monter/descendre), phases types.
- Tableau des postes annexes : colonnes « € / m² hab. » et « Observation ».

Co-Authored-By: Claude Opus 5.5 <noreply@anthropic.com>
Claude-Session: https://claude.ai/code/session_01C4D3JrxL38833KxvV1C5mu
</commit_message>
<xml_diff>
--- a/public/modeles/estimatif_A.docx
+++ b/public/modeles/estimatif_A.docx
@@ -75,6 +75,14 @@
     </w:p>
     <w:p>
       <w:pPr>
+        <w:spacing w:after="0"/>
+      </w:pPr>
+      <w:r>
+        <w:t xml:space="preserve">{#a_presentation}</w:t>
+      </w:r>
+    </w:p>
+    <w:p>
+      <w:pPr>
         <w:keepNext/>
         <w:pBdr>
           <w:bottom w:val="single" w:color="D4762A" w:sz="6" w:space="1"/>
@@ -120,6 +128,14 @@
         <w:spacing w:after="0"/>
       </w:pPr>
       <w:r>
+        <w:t xml:space="preserve">{/a_presentation}</w:t>
+      </w:r>
+    </w:p>
+    <w:p>
+      <w:pPr>
+        <w:spacing w:after="0"/>
+      </w:pPr>
+      <w:r>
         <w:t xml:space="preserve">{#a_est_objet}</w:t>
       </w:r>
     </w:p>
@@ -192,6 +208,14 @@
       </w:pPr>
       <w:r>
         <w:t xml:space="preserve">{/est_objet}</w:t>
+      </w:r>
+    </w:p>
+    <w:p>
+      <w:pPr>
+        <w:spacing w:after="0"/>
+      </w:pPr>
+      <w:r>
+        <w:t xml:space="preserve">{#a_est_ctr}</w:t>
       </w:r>
     </w:p>
     <w:p>
@@ -208,6 +232,14 @@
           <w:szCs w:val="17"/>
         </w:rPr>
         <w:t xml:space="preserve">Le détail de cette mission et son chiffrage font l'objet du document « Proposition d'honoraires » joint au présent dossier.</w:t>
+      </w:r>
+    </w:p>
+    <w:p>
+      <w:pPr>
+        <w:spacing w:after="0"/>
+      </w:pPr>
+      <w:r>
+        <w:t xml:space="preserve">{/a_est_ctr}</w:t>
       </w:r>
     </w:p>
     <w:p>
@@ -933,9 +965,10 @@
         <w:tblLayout w:type="fixed"/>
       </w:tblPr>
       <w:tblGrid>
-        <w:gridCol w:w="5600"/>
-        <w:gridCol w:w="1900"/>
-        <w:gridCol w:w="1900"/>
+        <w:gridCol w:w="3700"/>
+        <w:gridCol w:w="1450"/>
+        <w:gridCol w:w="1250"/>
+        <w:gridCol w:w="3000"/>
       </w:tblGrid>
       <w:tr>
         <w:trPr>
@@ -943,7 +976,7 @@
         </w:trPr>
         <w:tc>
           <w:tcPr>
-            <w:tcW w:type="dxa" w:w="5600"/>
+            <w:tcW w:type="dxa" w:w="3700"/>
             <w:shd w:fill="D4762A" w:color="auto" w:val="clear"/>
             <w:tcMar>
               <w:top w:type="dxa" w:w="70"/>
@@ -970,7 +1003,7 @@
         </w:tc>
         <w:tc>
           <w:tcPr>
-            <w:tcW w:type="dxa" w:w="1900"/>
+            <w:tcW w:type="dxa" w:w="1450"/>
             <w:shd w:fill="D4762A" w:color="auto" w:val="clear"/>
             <w:tcMar>
               <w:top w:type="dxa" w:w="70"/>
@@ -997,7 +1030,7 @@
         </w:tc>
         <w:tc>
           <w:tcPr>
-            <w:tcW w:type="dxa" w:w="1900"/>
+            <w:tcW w:type="dxa" w:w="1250"/>
             <w:shd w:fill="D4762A" w:color="auto" w:val="clear"/>
             <w:tcMar>
               <w:top w:type="dxa" w:w="70"/>
@@ -1019,6 +1052,33 @@
                 <w:szCs w:val="18"/>
               </w:rPr>
               <w:t xml:space="preserve">€ / m² hab.</w:t>
+            </w:r>
+          </w:p>
+        </w:tc>
+        <w:tc>
+          <w:tcPr>
+            <w:tcW w:type="dxa" w:w="3000"/>
+            <w:shd w:fill="D4762A" w:color="auto" w:val="clear"/>
+            <w:tcMar>
+              <w:top w:type="dxa" w:w="70"/>
+              <w:left w:type="dxa" w:w="110"/>
+              <w:bottom w:type="dxa" w:w="70"/>
+              <w:right w:type="dxa" w:w="110"/>
+            </w:tcMar>
+            <w:vAlign w:val="center"/>
+          </w:tcPr>
+          <w:p>
+            <w:pPr>
+              <w:spacing w:after="0" w:before="0" w:line="264" w:lineRule="auto"/>
+              <w:jc w:val="left"/>
+            </w:pPr>
+            <w:r>
+              <w:rPr>
+                <w:color w:val="FFFFFF"/>
+                <w:sz w:val="18"/>
+                <w:szCs w:val="18"/>
+              </w:rPr>
+              <w:t xml:space="preserve">Observation</w:t>
             </w:r>
           </w:p>
         </w:tc>
@@ -1026,7 +1086,7 @@
       <w:tr>
         <w:tc>
           <w:tcPr>
-            <w:tcW w:type="dxa" w:w="5600"/>
+            <w:tcW w:type="dxa" w:w="3700"/>
             <w:tcMar>
               <w:top w:type="dxa" w:w="70"/>
               <w:left w:type="dxa" w:w="110"/>
@@ -1051,7 +1111,7 @@
         </w:tc>
         <w:tc>
           <w:tcPr>
-            <w:tcW w:type="dxa" w:w="1900"/>
+            <w:tcW w:type="dxa" w:w="1450"/>
             <w:tcMar>
               <w:top w:type="dxa" w:w="70"/>
               <w:left w:type="dxa" w:w="110"/>
@@ -1076,7 +1136,7 @@
         </w:tc>
         <w:tc>
           <w:tcPr>
-            <w:tcW w:type="dxa" w:w="1900"/>
+            <w:tcW w:type="dxa" w:w="1250"/>
             <w:tcMar>
               <w:top w:type="dxa" w:w="70"/>
               <w:left w:type="dxa" w:w="110"/>
@@ -1095,7 +1155,32 @@
                 <w:sz w:val="18"/>
                 <w:szCs w:val="18"/>
               </w:rPr>
-              <w:t xml:space="preserve">{m2}{/o}</w:t>
+              <w:t xml:space="preserve">{m2}</w:t>
+            </w:r>
+          </w:p>
+        </w:tc>
+        <w:tc>
+          <w:tcPr>
+            <w:tcW w:type="dxa" w:w="3000"/>
+            <w:tcMar>
+              <w:top w:type="dxa" w:w="70"/>
+              <w:left w:type="dxa" w:w="110"/>
+              <w:bottom w:type="dxa" w:w="70"/>
+              <w:right w:type="dxa" w:w="110"/>
+            </w:tcMar>
+            <w:vAlign w:val="center"/>
+          </w:tcPr>
+          <w:p>
+            <w:pPr>
+              <w:spacing w:after="0" w:before="0" w:line="264" w:lineRule="auto"/>
+              <w:jc w:val="left"/>
+            </w:pPr>
+            <w:r>
+              <w:rPr>
+                <w:sz w:val="18"/>
+                <w:szCs w:val="18"/>
+              </w:rPr>
+              <w:t xml:space="preserve">{obs}{/o}</w:t>
             </w:r>
           </w:p>
         </w:tc>
@@ -1103,7 +1188,7 @@
       <w:tr>
         <w:tc>
           <w:tcPr>
-            <w:tcW w:type="dxa" w:w="5600"/>
+            <w:tcW w:type="dxa" w:w="3700"/>
             <w:shd w:fill="FBE5D6" w:color="auto" w:val="clear"/>
             <w:tcMar>
               <w:top w:type="dxa" w:w="70"/>
@@ -1129,7 +1214,7 @@
         </w:tc>
         <w:tc>
           <w:tcPr>
-            <w:tcW w:type="dxa" w:w="1900"/>
+            <w:tcW w:type="dxa" w:w="1450"/>
             <w:shd w:fill="FBE5D6" w:color="auto" w:val="clear"/>
             <w:tcMar>
               <w:top w:type="dxa" w:w="70"/>
@@ -1155,7 +1240,7 @@
         </w:tc>
         <w:tc>
           <w:tcPr>
-            <w:tcW w:type="dxa" w:w="1900"/>
+            <w:tcW w:type="dxa" w:w="1250"/>
             <w:shd w:fill="FBE5D6" w:color="auto" w:val="clear"/>
             <w:tcMar>
               <w:top w:type="dxa" w:w="70"/>
@@ -1175,7 +1260,33 @@
                 <w:sz w:val="18"/>
                 <w:szCs w:val="18"/>
               </w:rPr>
-              <w:t xml:space="preserve">{m2}{/e}{/annexes}</w:t>
+              <w:t xml:space="preserve">{m2}</w:t>
+            </w:r>
+          </w:p>
+        </w:tc>
+        <w:tc>
+          <w:tcPr>
+            <w:tcW w:type="dxa" w:w="3000"/>
+            <w:shd w:fill="FBE5D6" w:color="auto" w:val="clear"/>
+            <w:tcMar>
+              <w:top w:type="dxa" w:w="70"/>
+              <w:left w:type="dxa" w:w="110"/>
+              <w:bottom w:type="dxa" w:w="70"/>
+              <w:right w:type="dxa" w:w="110"/>
+            </w:tcMar>
+            <w:vAlign w:val="center"/>
+          </w:tcPr>
+          <w:p>
+            <w:pPr>
+              <w:spacing w:after="0" w:before="0" w:line="264" w:lineRule="auto"/>
+              <w:jc w:val="left"/>
+            </w:pPr>
+            <w:r>
+              <w:rPr>
+                <w:sz w:val="18"/>
+                <w:szCs w:val="18"/>
+              </w:rPr>
+              <w:t xml:space="preserve">{obs}{/e}{/annexes}</w:t>
             </w:r>
           </w:p>
         </w:tc>
@@ -1183,7 +1294,7 @@
       <w:tr>
         <w:tc>
           <w:tcPr>
-            <w:tcW w:type="dxa" w:w="5600"/>
+            <w:tcW w:type="dxa" w:w="3700"/>
             <w:shd w:fill="E07B39" w:color="auto" w:val="clear"/>
             <w:tcMar>
               <w:top w:type="dxa" w:w="70"/>
@@ -1210,8 +1321,8 @@
         </w:tc>
         <w:tc>
           <w:tcPr>
-            <w:tcW w:type="dxa" w:w="3800"/>
-            <w:gridSpan w:val="2"/>
+            <w:tcW w:type="dxa" w:w="5700"/>
+            <w:gridSpan w:val="3"/>
             <w:shd w:fill="E07B39" w:color="auto" w:val="clear"/>
             <w:tcMar>
               <w:top w:type="dxa" w:w="70"/>
@@ -1298,14 +1409,6 @@
         <w:spacing w:after="0"/>
       </w:pPr>
       <w:r>
-        <w:t xml:space="preserve">{/a_vigilance}</w:t>
-      </w:r>
-    </w:p>
-    <w:p>
-      <w:pPr>
-        <w:spacing w:after="0"/>
-      </w:pPr>
-      <w:r>
         <w:t xml:space="preserve">{#vigilance}</w:t>
       </w:r>
     </w:p>
@@ -1328,6 +1431,14 @@
       </w:pPr>
       <w:r>
         <w:t xml:space="preserve">{/vigilance}</w:t>
+      </w:r>
+    </w:p>
+    <w:p>
+      <w:pPr>
+        <w:spacing w:after="0"/>
+      </w:pPr>
+      <w:r>
+        <w:t xml:space="preserve">{/a_vigilance}</w:t>
       </w:r>
     </w:p>
     <w:p>

</xml_diff>

<commit_message>
Word Estimatif : titres en gras, lignes terrain et notaire, sections plus visibles
- Titres des sections de l'estimatif en gras (orange foncé, 12 pt), comme
  le chiffrage estimatif de référence.
- Postes annexes : « Coût d'acquisition du terrain » et « Frais de notaire
  sur le terrain » en tête (0 € modifiable, observation modifiable, hors
  base de la provision), ajoutés aussi aux estimatifs existants.
- Assistant : bloc « Textes du Word » ouvert et placé juste après le
  questionnaire ; lien « Reprendre le résumé de la fiche ».
- Avertissement avant le Word si des sections sont vides (elles
  n'apparaissent pas dans le document).

Co-Authored-By: Claude Opus 5.5 <noreply@anthropic.com>
Claude-Session: https://claude.ai/code/session_01C4D3JrxL38833KxvV1C5mu
</commit_message>
<xml_diff>
--- a/public/modeles/estimatif_A.docx
+++ b/public/modeles/estimatif_A.docx
@@ -91,9 +91,11 @@
       </w:pPr>
       <w:r>
         <w:rPr>
-          <w:color w:val="D4762A"/>
-          <w:sz w:val="23"/>
-          <w:szCs w:val="23"/>
+          <w:b/>
+          <w:bCs/>
+          <w:color w:val="C85A1E"/>
+          <w:sz w:val="24"/>
+          <w:szCs w:val="24"/>
         </w:rPr>
         <w:t xml:space="preserve">Présentation générale du projet</w:t>
       </w:r>
@@ -149,9 +151,11 @@
       </w:pPr>
       <w:r>
         <w:rPr>
-          <w:color w:val="D4762A"/>
-          <w:sz w:val="23"/>
-          <w:szCs w:val="23"/>
+          <w:b/>
+          <w:bCs/>
+          <w:color w:val="C85A1E"/>
+          <w:sz w:val="24"/>
+          <w:szCs w:val="24"/>
         </w:rPr>
         <w:t xml:space="preserve">Objet de la mission</w:t>
       </w:r>
@@ -260,9 +264,11 @@
       </w:pPr>
       <w:r>
         <w:rPr>
-          <w:color w:val="D4762A"/>
-          <w:sz w:val="23"/>
-          <w:szCs w:val="23"/>
+          <w:b/>
+          <w:bCs/>
+          <w:color w:val="C85A1E"/>
+          <w:sz w:val="24"/>
+          <w:szCs w:val="24"/>
         </w:rPr>
         <w:t xml:space="preserve">Base de calcul — estimatif prévisionnel des travaux</w:t>
       </w:r>
@@ -919,9 +925,11 @@
       </w:pPr>
       <w:r>
         <w:rPr>
-          <w:color w:val="D4762A"/>
-          <w:sz w:val="23"/>
-          <w:szCs w:val="23"/>
+          <w:b/>
+          <w:bCs/>
+          <w:color w:val="C85A1E"/>
+          <w:sz w:val="24"/>
+          <w:szCs w:val="24"/>
         </w:rPr>
         <w:t xml:space="preserve">Budget global prévisionnel — Travaux et annexes financières</w:t>
       </w:r>
@@ -1397,9 +1405,11 @@
       </w:pPr>
       <w:r>
         <w:rPr>
-          <w:color w:val="D4762A"/>
-          <w:sz w:val="23"/>
-          <w:szCs w:val="23"/>
+          <w:b/>
+          <w:bCs/>
+          <w:color w:val="C85A1E"/>
+          <w:sz w:val="24"/>
+          <w:szCs w:val="24"/>
         </w:rPr>
         <w:t xml:space="preserve">Points de vigilance à instruire en phase diagnostic</w:t>
       </w:r>
@@ -1451,9 +1461,11 @@
       </w:pPr>
       <w:r>
         <w:rPr>
-          <w:color w:val="D4762A"/>
-          <w:sz w:val="23"/>
-          <w:szCs w:val="23"/>
+          <w:b/>
+          <w:bCs/>
+          <w:color w:val="C85A1E"/>
+          <w:sz w:val="24"/>
+          <w:szCs w:val="24"/>
         </w:rPr>
         <w:t xml:space="preserve">Nature de l'estimation</w:t>
       </w:r>

</xml_diff>

<commit_message>
Estimatif : pré-remplissage de l'objet de la mission et de la présentation
- Objet de la mission généré depuis les contrats du dossier : mission
  complète (liste complète), permis de construire, suivi de chantier ;
  contrats séparés = une liste par mission avec sous-titre ; contrats
  libres ignorés ; ligne accessibilité PMR si cochée. Phrase « Proposition
  d'honoraires » au singulier ou au pluriel.
- Présentation composée depuis la fiche (nature, surface, commune, résumé).
- Les textes retouchés à la main ne sont jamais écrasés ; boutons pour
  régénérer. Modèle Word : sous-titres dans la liste des phases.

Co-Authored-By: Claude Opus 5.5 <noreply@anthropic.com>
Claude-Session: https://claude.ai/code/session_01C4D3JrxL38833KxvV1C5mu
</commit_message>
<xml_diff>
--- a/public/modeles/estimatif_A.docx
+++ b/public/modeles/estimatif_A.docx
@@ -195,6 +195,44 @@
     </w:p>
     <w:p>
       <w:pPr>
+        <w:spacing w:after="0"/>
+      </w:pPr>
+      <w:r>
+        <w:t xml:space="preserve">{#sous}</w:t>
+      </w:r>
+    </w:p>
+    <w:p>
+      <w:pPr>
+        <w:keepNext/>
+        <w:spacing w:after="40" w:before="80" w:line="264" w:lineRule="auto"/>
+        <w:jc w:val="left"/>
+      </w:pPr>
+      <w:r>
+        <w:rPr>
+          <w:b/>
+          <w:bCs/>
+        </w:rPr>
+        <w:t xml:space="preserve">{t}</w:t>
+      </w:r>
+    </w:p>
+    <w:p>
+      <w:pPr>
+        <w:spacing w:after="0"/>
+      </w:pPr>
+      <w:r>
+        <w:t xml:space="preserve">{/sous}</w:t>
+      </w:r>
+    </w:p>
+    <w:p>
+      <w:pPr>
+        <w:spacing w:after="0"/>
+      </w:pPr>
+      <w:r>
+        <w:t xml:space="preserve">{#p}</w:t>
+      </w:r>
+    </w:p>
+    <w:p>
+      <w:pPr>
         <w:pStyle w:val="ListParagraph"/>
         <w:numPr>
           <w:ilvl w:val="0"/>
@@ -203,7 +241,15 @@
         <w:spacing w:after="40" w:line="264" w:lineRule="auto"/>
       </w:pPr>
       <w:r>
-        <w:t xml:space="preserve">{.}</w:t>
+        <w:t xml:space="preserve">{t}</w:t>
+      </w:r>
+    </w:p>
+    <w:p>
+      <w:pPr>
+        <w:spacing w:after="0"/>
+      </w:pPr>
+      <w:r>
+        <w:t xml:space="preserve">{/p}</w:t>
       </w:r>
     </w:p>
     <w:p>
@@ -235,7 +281,7 @@
           <w:sz w:val="17"/>
           <w:szCs w:val="17"/>
         </w:rPr>
-        <w:t xml:space="preserve">Le détail de cette mission et son chiffrage font l'objet du document « Proposition d'honoraires » joint au présent dossier.</w:t>
+        <w:t xml:space="preserve">{est_ctr_phrase}</w:t>
       </w:r>
     </w:p>
     <w:p>

</xml_diff>